<commit_message>
posted discussion on dev-loop...
</commit_message>
<xml_diff>
--- a/discussions/read-me-first.docx
+++ b/discussions/read-me-first.docx
@@ -52,6 +52,74 @@
           <w:p>
             <w:pPr>
               <w:pStyle w:val="ember-view"/>
+              <w:rPr>
+                <w:rFonts w:ascii="Segoe UI" w:hAnsi="Segoe UI" w:cs="Segoe UI"/>
+                <w:sz w:val="20"/>
+                <w:szCs w:val="20"/>
+              </w:rPr>
+            </w:pPr>
+            <w:r>
+              <w:rPr>
+                <w:rFonts w:ascii="Segoe UI" w:hAnsi="Segoe UI" w:cs="Segoe UI"/>
+                <w:sz w:val="20"/>
+                <w:szCs w:val="20"/>
+              </w:rPr>
+              <w:t>2026-04-25</w:t>
+            </w:r>
+          </w:p>
+        </w:tc>
+        <w:tc>
+          <w:tcPr>
+            <w:tcW w:w="8095" w:type="dxa"/>
+          </w:tcPr>
+          <w:p>
+            <w:pPr>
+              <w:pStyle w:val="ember-view"/>
+              <w:spacing w:after="0" w:afterAutospacing="0"/>
+              <w:rPr>
+                <w:rFonts w:ascii="Segoe UI" w:hAnsi="Segoe UI" w:cs="Segoe UI"/>
+                <w:sz w:val="20"/>
+                <w:szCs w:val="20"/>
+              </w:rPr>
+            </w:pPr>
+            <w:r>
+              <w:rPr>
+                <w:rFonts w:ascii="Segoe UI" w:hAnsi="Segoe UI" w:cs="Segoe UI"/>
+                <w:sz w:val="20"/>
+                <w:szCs w:val="20"/>
+              </w:rPr>
+              <w:t>discussion.im.day2.stp.draft-5.docx</w:t>
+            </w:r>
+          </w:p>
+          <w:p>
+            <w:pPr>
+              <w:pStyle w:val="ember-view"/>
+              <w:spacing w:before="0" w:beforeAutospacing="0"/>
+              <w:rPr>
+                <w:rFonts w:ascii="Segoe UI" w:hAnsi="Segoe UI" w:cs="Segoe UI"/>
+                <w:sz w:val="20"/>
+                <w:szCs w:val="20"/>
+              </w:rPr>
+            </w:pPr>
+            <w:r>
+              <w:rPr>
+                <w:rFonts w:ascii="Segoe UI" w:hAnsi="Segoe UI" w:cs="Segoe UI"/>
+                <w:sz w:val="20"/>
+                <w:szCs w:val="20"/>
+              </w:rPr>
+              <w:t>discussion.im.day2.stp.draft-5.png</w:t>
+            </w:r>
+          </w:p>
+        </w:tc>
+      </w:tr>
+      <w:tr>
+        <w:tc>
+          <w:tcPr>
+            <w:tcW w:w="1255" w:type="dxa"/>
+          </w:tcPr>
+          <w:p>
+            <w:pPr>
+              <w:pStyle w:val="ember-view"/>
               <w:spacing w:before="0" w:beforeAutospacing="0" w:after="0" w:afterAutospacing="0"/>
               <w:textAlignment w:val="baseline"/>
               <w:rPr>
@@ -74,15 +142,7 @@
                 <w:sz w:val="20"/>
                 <w:szCs w:val="20"/>
               </w:rPr>
-              <w:t>4-</w:t>
-            </w:r>
-            <w:r>
-              <w:rPr>
-                <w:rFonts w:ascii="Segoe UI" w:hAnsi="Segoe UI" w:cs="Segoe UI"/>
-                <w:sz w:val="20"/>
-                <w:szCs w:val="20"/>
-              </w:rPr>
-              <w:t>25</w:t>
+              <w:t>4-25</w:t>
             </w:r>
           </w:p>
         </w:tc>
@@ -2970,7 +3030,6 @@
   <w:style w:type="character" w:default="1" w:styleId="DefaultParagraphFont">
     <w:name w:val="Default Paragraph Font"/>
     <w:uiPriority w:val="1"/>
-    <w:semiHidden/>
     <w:unhideWhenUsed/>
   </w:style>
   <w:style w:type="table" w:default="1" w:styleId="TableNormal">

</xml_diff>

<commit_message>
update r0 to r1 release 1.
</commit_message>
<xml_diff>
--- a/discussions/read-me-first.docx
+++ b/discussions/read-me-first.docx
@@ -52,19 +52,37 @@
           <w:p>
             <w:pPr>
               <w:pStyle w:val="ember-view"/>
-              <w:rPr>
-                <w:rFonts w:ascii="Segoe UI" w:hAnsi="Segoe UI" w:cs="Segoe UI"/>
-                <w:sz w:val="20"/>
-                <w:szCs w:val="20"/>
-              </w:rPr>
-            </w:pPr>
-            <w:r>
-              <w:rPr>
-                <w:rFonts w:ascii="Segoe UI" w:hAnsi="Segoe UI" w:cs="Segoe UI"/>
-                <w:sz w:val="20"/>
-                <w:szCs w:val="20"/>
-              </w:rPr>
-              <w:t>2026-04-25</w:t>
+              <w:spacing w:before="0" w:beforeAutospacing="0" w:after="0" w:afterAutospacing="0"/>
+              <w:textAlignment w:val="baseline"/>
+              <w:rPr>
+                <w:rFonts w:ascii="Segoe UI" w:hAnsi="Segoe UI" w:cs="Segoe UI"/>
+                <w:sz w:val="20"/>
+                <w:szCs w:val="20"/>
+              </w:rPr>
+            </w:pPr>
+            <w:r>
+              <w:rPr>
+                <w:rFonts w:ascii="Segoe UI" w:hAnsi="Segoe UI" w:cs="Segoe UI"/>
+                <w:sz w:val="20"/>
+                <w:szCs w:val="20"/>
+              </w:rPr>
+              <w:t>2026-0</w:t>
+            </w:r>
+            <w:r>
+              <w:rPr>
+                <w:rFonts w:ascii="Segoe UI" w:hAnsi="Segoe UI" w:cs="Segoe UI"/>
+                <w:sz w:val="20"/>
+                <w:szCs w:val="20"/>
+              </w:rPr>
+              <w:t>5-0</w:t>
+            </w:r>
+            <w:r>
+              <w:rPr>
+                <w:rFonts w:ascii="Segoe UI" w:hAnsi="Segoe UI" w:cs="Segoe UI"/>
+                <w:sz w:val="20"/>
+                <w:szCs w:val="20"/>
+              </w:rPr>
+              <w:t>9</w:t>
             </w:r>
           </w:p>
         </w:tc>
@@ -75,39 +93,161 @@
           <w:p>
             <w:pPr>
               <w:pStyle w:val="ember-view"/>
-              <w:spacing w:after="0" w:afterAutospacing="0"/>
-              <w:rPr>
-                <w:rFonts w:ascii="Segoe UI" w:hAnsi="Segoe UI" w:cs="Segoe UI"/>
-                <w:sz w:val="20"/>
-                <w:szCs w:val="20"/>
-              </w:rPr>
-            </w:pPr>
-            <w:r>
-              <w:rPr>
-                <w:rFonts w:ascii="Segoe UI" w:hAnsi="Segoe UI" w:cs="Segoe UI"/>
-                <w:sz w:val="20"/>
-                <w:szCs w:val="20"/>
-              </w:rPr>
-              <w:t>discussion.im.day2.stp.draft-5.docx</w:t>
-            </w:r>
-          </w:p>
-          <w:p>
-            <w:pPr>
-              <w:pStyle w:val="ember-view"/>
-              <w:spacing w:before="0" w:beforeAutospacing="0"/>
-              <w:rPr>
-                <w:rFonts w:ascii="Segoe UI" w:hAnsi="Segoe UI" w:cs="Segoe UI"/>
-                <w:sz w:val="20"/>
-                <w:szCs w:val="20"/>
-              </w:rPr>
-            </w:pPr>
-            <w:r>
-              <w:rPr>
-                <w:rFonts w:ascii="Segoe UI" w:hAnsi="Segoe UI" w:cs="Segoe UI"/>
-                <w:sz w:val="20"/>
-                <w:szCs w:val="20"/>
-              </w:rPr>
-              <w:t>discussion.im.day2.stp.draft-5.png</w:t>
+              <w:spacing w:before="0" w:beforeAutospacing="0" w:after="0" w:afterAutospacing="0"/>
+              <w:textAlignment w:val="baseline"/>
+              <w:rPr>
+                <w:rFonts w:ascii="Segoe UI" w:hAnsi="Segoe UI" w:cs="Segoe UI"/>
+                <w:sz w:val="20"/>
+                <w:szCs w:val="20"/>
+              </w:rPr>
+            </w:pPr>
+            <w:r>
+              <w:rPr>
+                <w:rFonts w:ascii="Segoe UI" w:hAnsi="Segoe UI" w:cs="Segoe UI"/>
+                <w:sz w:val="20"/>
+                <w:szCs w:val="20"/>
+              </w:rPr>
+              <w:t>imhotep.isl.presenting_release_1</w:t>
+            </w:r>
+            <w:r>
+              <w:rPr>
+                <w:rFonts w:ascii="Segoe UI" w:hAnsi="Segoe UI" w:cs="Segoe UI"/>
+                <w:sz w:val="20"/>
+                <w:szCs w:val="20"/>
+              </w:rPr>
+              <w:t>.docx</w:t>
+            </w:r>
+          </w:p>
+          <w:p>
+            <w:pPr>
+              <w:pStyle w:val="ember-view"/>
+              <w:spacing w:before="0" w:beforeAutospacing="0" w:after="0" w:afterAutospacing="0"/>
+              <w:textAlignment w:val="baseline"/>
+              <w:rPr>
+                <w:rFonts w:ascii="Segoe UI" w:hAnsi="Segoe UI" w:cs="Segoe UI"/>
+                <w:sz w:val="20"/>
+                <w:szCs w:val="20"/>
+              </w:rPr>
+            </w:pPr>
+            <w:r>
+              <w:rPr>
+                <w:rFonts w:ascii="Segoe UI" w:hAnsi="Segoe UI" w:cs="Segoe UI"/>
+                <w:sz w:val="20"/>
+                <w:szCs w:val="20"/>
+              </w:rPr>
+              <w:t>imhotep.isl.presenting_release_1</w:t>
+            </w:r>
+            <w:r>
+              <w:rPr>
+                <w:rFonts w:ascii="Segoe UI" w:hAnsi="Segoe UI" w:cs="Segoe UI"/>
+                <w:sz w:val="20"/>
+                <w:szCs w:val="20"/>
+              </w:rPr>
+              <w:t>.png</w:t>
+            </w:r>
+          </w:p>
+        </w:tc>
+      </w:tr>
+      <w:tr>
+        <w:tc>
+          <w:tcPr>
+            <w:tcW w:w="1255" w:type="dxa"/>
+          </w:tcPr>
+          <w:p>
+            <w:pPr>
+              <w:pStyle w:val="ember-view"/>
+              <w:spacing w:before="0" w:beforeAutospacing="0" w:after="0" w:afterAutospacing="0"/>
+              <w:textAlignment w:val="baseline"/>
+              <w:rPr>
+                <w:rFonts w:ascii="Segoe UI" w:hAnsi="Segoe UI" w:cs="Segoe UI"/>
+                <w:sz w:val="20"/>
+                <w:szCs w:val="20"/>
+              </w:rPr>
+            </w:pPr>
+            <w:r>
+              <w:rPr>
+                <w:rFonts w:ascii="Segoe UI" w:hAnsi="Segoe UI" w:cs="Segoe UI"/>
+                <w:sz w:val="20"/>
+                <w:szCs w:val="20"/>
+              </w:rPr>
+              <w:t>2026-0</w:t>
+            </w:r>
+            <w:r>
+              <w:rPr>
+                <w:rFonts w:ascii="Segoe UI" w:hAnsi="Segoe UI" w:cs="Segoe UI"/>
+                <w:sz w:val="20"/>
+                <w:szCs w:val="20"/>
+              </w:rPr>
+              <w:t>5-02</w:t>
+            </w:r>
+          </w:p>
+        </w:tc>
+        <w:tc>
+          <w:tcPr>
+            <w:tcW w:w="8095" w:type="dxa"/>
+          </w:tcPr>
+          <w:p>
+            <w:pPr>
+              <w:pStyle w:val="ember-view"/>
+              <w:spacing w:before="0" w:beforeAutospacing="0" w:after="0" w:afterAutospacing="0"/>
+              <w:textAlignment w:val="baseline"/>
+              <w:rPr>
+                <w:rFonts w:ascii="Segoe UI" w:hAnsi="Segoe UI" w:cs="Segoe UI"/>
+                <w:sz w:val="20"/>
+                <w:szCs w:val="20"/>
+              </w:rPr>
+            </w:pPr>
+            <w:r>
+              <w:rPr>
+                <w:rFonts w:ascii="Segoe UI" w:hAnsi="Segoe UI" w:cs="Segoe UI"/>
+                <w:sz w:val="20"/>
+                <w:szCs w:val="20"/>
+              </w:rPr>
+              <w:t>discussion.im.</w:t>
+            </w:r>
+            <w:r>
+              <w:rPr>
+                <w:rFonts w:ascii="Segoe UI" w:hAnsi="Segoe UI" w:cs="Segoe UI"/>
+                <w:sz w:val="20"/>
+                <w:szCs w:val="20"/>
+              </w:rPr>
+              <w:t>dev-loop.docx</w:t>
+            </w:r>
+          </w:p>
+          <w:p>
+            <w:pPr>
+              <w:pStyle w:val="ember-view"/>
+              <w:spacing w:before="0" w:beforeAutospacing="0" w:after="0" w:afterAutospacing="0"/>
+              <w:textAlignment w:val="baseline"/>
+              <w:rPr>
+                <w:rFonts w:ascii="Segoe UI" w:hAnsi="Segoe UI" w:cs="Segoe UI"/>
+                <w:sz w:val="20"/>
+                <w:szCs w:val="20"/>
+              </w:rPr>
+            </w:pPr>
+            <w:r>
+              <w:rPr>
+                <w:rFonts w:ascii="Segoe UI" w:hAnsi="Segoe UI" w:cs="Segoe UI"/>
+                <w:sz w:val="20"/>
+                <w:szCs w:val="20"/>
+              </w:rPr>
+              <w:t>discussion.im.</w:t>
+            </w:r>
+            <w:r>
+              <w:rPr>
+                <w:rFonts w:ascii="Segoe UI" w:hAnsi="Segoe UI" w:cs="Segoe UI"/>
+                <w:sz w:val="20"/>
+                <w:szCs w:val="20"/>
+              </w:rPr>
+              <w:t>dev-loop</w:t>
+            </w:r>
+            <w:r>
+              <w:rPr>
+                <w:rFonts w:ascii="Segoe UI" w:hAnsi="Segoe UI" w:cs="Segoe UI"/>
+                <w:sz w:val="20"/>
+                <w:szCs w:val="20"/>
+              </w:rPr>
+              <w:t>.png</w:t>
             </w:r>
           </w:p>
         </w:tc>
@@ -3030,6 +3170,7 @@
   <w:style w:type="character" w:default="1" w:styleId="DefaultParagraphFont">
     <w:name w:val="Default Paragraph Font"/>
     <w:uiPriority w:val="1"/>
+    <w:semiHidden/>
     <w:unhideWhenUsed/>
   </w:style>
   <w:style w:type="table" w:default="1" w:styleId="TableNormal">

</xml_diff>

<commit_message>
Forgot to update the read-me-first...
</commit_message>
<xml_diff>
--- a/discussions/read-me-first.docx
+++ b/discussions/read-me-first.docx
@@ -74,15 +74,127 @@
                 <w:sz w:val="20"/>
                 <w:szCs w:val="20"/>
               </w:rPr>
-              <w:t>5-0</w:t>
-            </w:r>
-            <w:r>
-              <w:rPr>
-                <w:rFonts w:ascii="Segoe UI" w:hAnsi="Segoe UI" w:cs="Segoe UI"/>
-                <w:sz w:val="20"/>
-                <w:szCs w:val="20"/>
-              </w:rPr>
-              <w:t>9</w:t>
+              <w:t>5-</w:t>
+            </w:r>
+            <w:r>
+              <w:rPr>
+                <w:rFonts w:ascii="Segoe UI" w:hAnsi="Segoe UI" w:cs="Segoe UI"/>
+                <w:sz w:val="20"/>
+                <w:szCs w:val="20"/>
+              </w:rPr>
+              <w:t>16</w:t>
+            </w:r>
+          </w:p>
+        </w:tc>
+        <w:tc>
+          <w:tcPr>
+            <w:tcW w:w="8095" w:type="dxa"/>
+          </w:tcPr>
+          <w:p>
+            <w:pPr>
+              <w:pStyle w:val="ember-view"/>
+              <w:spacing w:before="0" w:beforeAutospacing="0" w:after="0" w:afterAutospacing="0"/>
+              <w:textAlignment w:val="baseline"/>
+              <w:rPr>
+                <w:rFonts w:ascii="Segoe UI" w:hAnsi="Segoe UI" w:cs="Segoe UI"/>
+                <w:sz w:val="20"/>
+                <w:szCs w:val="20"/>
+              </w:rPr>
+            </w:pPr>
+            <w:r>
+              <w:rPr>
+                <w:rFonts w:ascii="Segoe UI" w:hAnsi="Segoe UI" w:cs="Segoe UI"/>
+                <w:sz w:val="20"/>
+                <w:szCs w:val="20"/>
+              </w:rPr>
+              <w:t>imhotep.isl</w:t>
+            </w:r>
+            <w:r>
+              <w:rPr>
+                <w:rFonts w:ascii="Segoe UI" w:hAnsi="Segoe UI" w:cs="Segoe UI"/>
+                <w:sz w:val="20"/>
+                <w:szCs w:val="20"/>
+              </w:rPr>
+              <w:t>r1.construction_boundaries</w:t>
+            </w:r>
+            <w:r>
+              <w:rPr>
+                <w:rFonts w:ascii="Segoe UI" w:hAnsi="Segoe UI" w:cs="Segoe UI"/>
+                <w:sz w:val="20"/>
+                <w:szCs w:val="20"/>
+              </w:rPr>
+              <w:t>.docx</w:t>
+            </w:r>
+          </w:p>
+          <w:p>
+            <w:pPr>
+              <w:pStyle w:val="ember-view"/>
+              <w:spacing w:before="0" w:beforeAutospacing="0" w:after="0" w:afterAutospacing="0"/>
+              <w:textAlignment w:val="baseline"/>
+              <w:rPr>
+                <w:rFonts w:ascii="Segoe UI" w:hAnsi="Segoe UI" w:cs="Segoe UI"/>
+                <w:sz w:val="20"/>
+                <w:szCs w:val="20"/>
+              </w:rPr>
+            </w:pPr>
+            <w:r>
+              <w:rPr>
+                <w:rFonts w:ascii="Segoe UI" w:hAnsi="Segoe UI" w:cs="Segoe UI"/>
+                <w:sz w:val="20"/>
+                <w:szCs w:val="20"/>
+              </w:rPr>
+              <w:t>imhotep.isl</w:t>
+            </w:r>
+            <w:r>
+              <w:rPr>
+                <w:rFonts w:ascii="Segoe UI" w:hAnsi="Segoe UI" w:cs="Segoe UI"/>
+                <w:sz w:val="20"/>
+                <w:szCs w:val="20"/>
+              </w:rPr>
+              <w:t>r1.construction_boundaries</w:t>
+            </w:r>
+            <w:r>
+              <w:rPr>
+                <w:rFonts w:ascii="Segoe UI" w:hAnsi="Segoe UI" w:cs="Segoe UI"/>
+                <w:sz w:val="20"/>
+                <w:szCs w:val="20"/>
+              </w:rPr>
+              <w:t>.png</w:t>
+            </w:r>
+          </w:p>
+        </w:tc>
+      </w:tr>
+      <w:tr>
+        <w:tc>
+          <w:tcPr>
+            <w:tcW w:w="1255" w:type="dxa"/>
+          </w:tcPr>
+          <w:p>
+            <w:pPr>
+              <w:pStyle w:val="ember-view"/>
+              <w:spacing w:before="0" w:beforeAutospacing="0" w:after="0" w:afterAutospacing="0"/>
+              <w:textAlignment w:val="baseline"/>
+              <w:rPr>
+                <w:rFonts w:ascii="Segoe UI" w:hAnsi="Segoe UI" w:cs="Segoe UI"/>
+                <w:sz w:val="20"/>
+                <w:szCs w:val="20"/>
+              </w:rPr>
+            </w:pPr>
+            <w:r>
+              <w:rPr>
+                <w:rFonts w:ascii="Segoe UI" w:hAnsi="Segoe UI" w:cs="Segoe UI"/>
+                <w:sz w:val="20"/>
+                <w:szCs w:val="20"/>
+              </w:rPr>
+              <w:t>2026-0</w:t>
+            </w:r>
+            <w:r>
+              <w:rPr>
+                <w:rFonts w:ascii="Segoe UI" w:hAnsi="Segoe UI" w:cs="Segoe UI"/>
+                <w:sz w:val="20"/>
+                <w:szCs w:val="20"/>
+              </w:rPr>
+              <w:t>5-09</w:t>
             </w:r>
           </w:p>
         </w:tc>

</xml_diff>

<commit_message>
ISL r1 update... and related discussions.
</commit_message>
<xml_diff>
--- a/discussions/read-me-first.docx
+++ b/discussions/read-me-first.docx
@@ -82,7 +82,7 @@
                 <w:sz w:val="20"/>
                 <w:szCs w:val="20"/>
               </w:rPr>
-              <w:t>16</w:t>
+              <w:t>24</w:t>
             </w:r>
           </w:p>
         </w:tc>
@@ -107,6 +107,102 @@
                 <w:sz w:val="20"/>
                 <w:szCs w:val="20"/>
               </w:rPr>
+              <w:t>discussion.im.macs.concept-2-construction</w:t>
+            </w:r>
+            <w:r>
+              <w:rPr>
+                <w:rFonts w:ascii="Segoe UI" w:hAnsi="Segoe UI" w:cs="Segoe UI"/>
+                <w:sz w:val="20"/>
+                <w:szCs w:val="20"/>
+              </w:rPr>
+              <w:t>.docx</w:t>
+            </w:r>
+          </w:p>
+          <w:p>
+            <w:pPr>
+              <w:pStyle w:val="ember-view"/>
+              <w:spacing w:before="0" w:beforeAutospacing="0" w:after="0" w:afterAutospacing="0"/>
+              <w:textAlignment w:val="baseline"/>
+              <w:rPr>
+                <w:rFonts w:ascii="Segoe UI" w:hAnsi="Segoe UI" w:cs="Segoe UI"/>
+                <w:sz w:val="20"/>
+                <w:szCs w:val="20"/>
+              </w:rPr>
+            </w:pPr>
+            <w:r>
+              <w:rPr>
+                <w:rFonts w:ascii="Segoe UI" w:hAnsi="Segoe UI" w:cs="Segoe UI"/>
+                <w:sz w:val="20"/>
+                <w:szCs w:val="20"/>
+              </w:rPr>
+              <w:t>discussion.im.macs.concept-2-construction</w:t>
+            </w:r>
+            <w:r>
+              <w:rPr>
+                <w:rFonts w:ascii="Segoe UI" w:hAnsi="Segoe UI" w:cs="Segoe UI"/>
+                <w:sz w:val="20"/>
+                <w:szCs w:val="20"/>
+              </w:rPr>
+              <w:t>.png</w:t>
+            </w:r>
+          </w:p>
+        </w:tc>
+      </w:tr>
+      <w:tr>
+        <w:tc>
+          <w:tcPr>
+            <w:tcW w:w="1255" w:type="dxa"/>
+          </w:tcPr>
+          <w:p>
+            <w:pPr>
+              <w:pStyle w:val="ember-view"/>
+              <w:spacing w:before="0" w:beforeAutospacing="0" w:after="0" w:afterAutospacing="0"/>
+              <w:textAlignment w:val="baseline"/>
+              <w:rPr>
+                <w:rFonts w:ascii="Segoe UI" w:hAnsi="Segoe UI" w:cs="Segoe UI"/>
+                <w:sz w:val="20"/>
+                <w:szCs w:val="20"/>
+              </w:rPr>
+            </w:pPr>
+            <w:r>
+              <w:rPr>
+                <w:rFonts w:ascii="Segoe UI" w:hAnsi="Segoe UI" w:cs="Segoe UI"/>
+                <w:sz w:val="20"/>
+                <w:szCs w:val="20"/>
+              </w:rPr>
+              <w:t>2026-0</w:t>
+            </w:r>
+            <w:r>
+              <w:rPr>
+                <w:rFonts w:ascii="Segoe UI" w:hAnsi="Segoe UI" w:cs="Segoe UI"/>
+                <w:sz w:val="20"/>
+                <w:szCs w:val="20"/>
+              </w:rPr>
+              <w:t>5-16</w:t>
+            </w:r>
+          </w:p>
+        </w:tc>
+        <w:tc>
+          <w:tcPr>
+            <w:tcW w:w="8095" w:type="dxa"/>
+          </w:tcPr>
+          <w:p>
+            <w:pPr>
+              <w:pStyle w:val="ember-view"/>
+              <w:spacing w:before="0" w:beforeAutospacing="0" w:after="0" w:afterAutospacing="0"/>
+              <w:textAlignment w:val="baseline"/>
+              <w:rPr>
+                <w:rFonts w:ascii="Segoe UI" w:hAnsi="Segoe UI" w:cs="Segoe UI"/>
+                <w:sz w:val="20"/>
+                <w:szCs w:val="20"/>
+              </w:rPr>
+            </w:pPr>
+            <w:r>
+              <w:rPr>
+                <w:rFonts w:ascii="Segoe UI" w:hAnsi="Segoe UI" w:cs="Segoe UI"/>
+                <w:sz w:val="20"/>
+                <w:szCs w:val="20"/>
+              </w:rPr>
               <w:t>imhotep.isl</w:t>
             </w:r>
             <w:r>
@@ -115,15 +211,7 @@
                 <w:sz w:val="20"/>
                 <w:szCs w:val="20"/>
               </w:rPr>
-              <w:t>r1.construction_boundaries</w:t>
-            </w:r>
-            <w:r>
-              <w:rPr>
-                <w:rFonts w:ascii="Segoe UI" w:hAnsi="Segoe UI" w:cs="Segoe UI"/>
-                <w:sz w:val="20"/>
-                <w:szCs w:val="20"/>
-              </w:rPr>
-              <w:t>.docx</w:t>
+              <w:t>r1.construction_boundaries.docx</w:t>
             </w:r>
           </w:p>
           <w:p>

</xml_diff>